<commit_message>
docs: explicit macOS install block (Apple command-line tools, branch checkout, pip upgrade)
An operator on a Mac pasted the Windows commands. Quick guide and manual now give the Mac commands in full,
say to accept Apple's command-line tools (git + Python 3) when macOS offers them, and check out the
feat/pyside-poc branch (missing from the manual's macOS block).

Co-Authored-By: Claude Opus 5.5 <noreply@anthropic.com>
</commit_message>
<xml_diff>
--- a/docs/GUIDA_RAPIDA.docx
+++ b/docs/GUIDA_RAPIDA.docx
@@ -213,10 +213,105 @@
         <w:t xml:space="preserve"> </w:t>
       </w:r>
       <w:r>
-        <w:t xml:space="preserve">(Terminale): stessi comandi, con</w:t>
-      </w:r>
-      <w:r>
-        <w:t xml:space="preserve"> </w:t>
+        <w:t xml:space="preserve">(Terminale). I comandi sono diversi da quelli di Windows: non copiare il blocco sopra. Al primo</w:t>
+      </w:r>
+      <w:r>
+        <w:t xml:space="preserve"> </w:t>
+      </w:r>
+      <w:r>
+        <w:rPr>
+          <w:rStyle w:val="VerbatimChar"/>
+        </w:rPr>
+        <w:t xml:space="preserve">git</w:t>
+      </w:r>
+      <w:r>
+        <w:t xml:space="preserve"> </w:t>
+      </w:r>
+      <w:r>
+        <w:t xml:space="preserve">il Mac propone di installare gli</w:t>
+      </w:r>
+      <w:r>
+        <w:t xml:space="preserve"> </w:t>
+      </w:r>
+      <w:r>
+        <w:rPr>
+          <w:i/>
+        </w:rPr>
+        <w:t xml:space="preserve">strumenti per lo sviluppo da riga di comando</w:t>
+      </w:r>
+      <w:r>
+        <w:t xml:space="preserve">:</w:t>
+      </w:r>
+      <w:r>
+        <w:t xml:space="preserve"> </w:t>
+      </w:r>
+      <w:r>
+        <w:rPr>
+          <w:b/>
+        </w:rPr>
+        <w:t xml:space="preserve">Installa</w:t>
+      </w:r>
+      <w:r>
+        <w:t xml:space="preserve"> </w:t>
+      </w:r>
+      <w:r>
+        <w:t xml:space="preserve">e</w:t>
+      </w:r>
+      <w:r>
+        <w:t xml:space="preserve"> </w:t>
+      </w:r>
+      <w:r>
+        <w:rPr>
+          <w:b/>
+        </w:rPr>
+        <w:t xml:space="preserve">Accetta</w:t>
+      </w:r>
+      <w:r>
+        <w:t xml:space="preserve"> </w:t>
+      </w:r>
+      <w:r>
+        <w:t xml:space="preserve">(pacchetto ufficiale Apple con git e Python 3, alcuni minuti), poi riaprire il Terminale.</w:t>
+      </w:r>
+    </w:p>
+    <w:p>
+      <w:pPr>
+        <w:pStyle w:val="SourceCode"/>
+      </w:pPr>
+      <w:r>
+        <w:rPr>
+          <w:rStyle w:val="VerbatimChar"/>
+        </w:rPr>
+        <w:t xml:space="preserve">cd ~/Documents</w:t>
+      </w:r>
+      <w:r>
+        <w:br/>
+      </w:r>
+      <w:r>
+        <w:rPr>
+          <w:rStyle w:val="VerbatimChar"/>
+        </w:rPr>
+        <w:t xml:space="preserve">git clone https://github.com/ringo977/cardiac-fp-analyzer.git</w:t>
+      </w:r>
+      <w:r>
+        <w:br/>
+      </w:r>
+      <w:r>
+        <w:rPr>
+          <w:rStyle w:val="VerbatimChar"/>
+        </w:rPr>
+        <w:t xml:space="preserve">cd cardiac-fp-analyzer</w:t>
+      </w:r>
+      <w:r>
+        <w:br/>
+      </w:r>
+      <w:r>
+        <w:rPr>
+          <w:rStyle w:val="VerbatimChar"/>
+        </w:rPr>
+        <w:t xml:space="preserve">git checkout feat/pyside-poc</w:t>
+      </w:r>
+      <w:r>
+        <w:br/>
       </w:r>
       <w:r>
         <w:rPr>
@@ -225,19 +320,81 @@
         <w:t xml:space="preserve">python3 -m venv .venv</w:t>
       </w:r>
       <w:r>
-        <w:t xml:space="preserve"> </w:t>
-      </w:r>
-      <w:r>
-        <w:t xml:space="preserve">e</w:t>
-      </w:r>
-      <w:r>
-        <w:t xml:space="preserve"> </w:t>
+        <w:br/>
       </w:r>
       <w:r>
         <w:rPr>
           <w:rStyle w:val="VerbatimChar"/>
         </w:rPr>
         <w:t xml:space="preserve">source .venv/bin/activate</w:t>
+      </w:r>
+      <w:r>
+        <w:br/>
+      </w:r>
+      <w:r>
+        <w:rPr>
+          <w:rStyle w:val="VerbatimChar"/>
+        </w:rPr>
+        <w:t xml:space="preserve">python -m pip install --upgrade pip</w:t>
+      </w:r>
+      <w:r>
+        <w:br/>
+      </w:r>
+      <w:r>
+        <w:rPr>
+          <w:rStyle w:val="VerbatimChar"/>
+        </w:rPr>
+        <w:t xml:space="preserve">pip install -e ".[gui,reports,mcs,nwb]"</w:t>
+      </w:r>
+      <w:r>
+        <w:br/>
+      </w:r>
+      <w:r>
+        <w:rPr>
+          <w:rStyle w:val="VerbatimChar"/>
+        </w:rPr>
+        <w:t xml:space="preserve">cardiac-fp-gui</w:t>
+      </w:r>
+    </w:p>
+    <w:p>
+      <w:pPr>
+        <w:pStyle w:val="FirstParagraph"/>
+      </w:pPr>
+      <w:r>
+        <w:t xml:space="preserve">Volte successive (Mac):</w:t>
+      </w:r>
+      <w:r>
+        <w:t xml:space="preserve"> </w:t>
+      </w:r>
+      <w:r>
+        <w:rPr>
+          <w:rStyle w:val="VerbatimChar"/>
+        </w:rPr>
+        <w:t xml:space="preserve">cd ~/Documents/cardiac-fp-analyzer</w:t>
+      </w:r>
+      <w:r>
+        <w:t xml:space="preserve">,</w:t>
+      </w:r>
+      <w:r>
+        <w:t xml:space="preserve"> </w:t>
+      </w:r>
+      <w:r>
+        <w:rPr>
+          <w:rStyle w:val="VerbatimChar"/>
+        </w:rPr>
+        <w:t xml:space="preserve">source .venv/bin/activate</w:t>
+      </w:r>
+      <w:r>
+        <w:t xml:space="preserve">,</w:t>
+      </w:r>
+      <w:r>
+        <w:t xml:space="preserve"> </w:t>
+      </w:r>
+      <w:r>
+        <w:rPr>
+          <w:rStyle w:val="VerbatimChar"/>
+        </w:rPr>
+        <w:t xml:space="preserve">cardiac-fp-gui</w:t>
       </w:r>
       <w:r>
         <w:t xml:space="preserve">.</w:t>

</xml_diff>